<commit_message>
docs: typos in report
</commit_message>
<xml_diff>
--- a/docs/RCOM.docx
+++ b/docs/RCOM.docx
@@ -236,14 +236,28 @@
           <w:sz w:val="22"/>
           <w:szCs w:val="22"/>
         </w:rPr>
-        <w:t xml:space="preserve"> difference. I will </w:t>
-      </w:r>
-      <w:r>
-        <w:rPr>
-          <w:sz w:val="22"/>
-          <w:szCs w:val="22"/>
-        </w:rPr>
-        <w:t>analyse this finding in the report.</w:t>
+        <w:t xml:space="preserve"> difference. </w:t>
+      </w:r>
+      <w:r>
+        <w:rPr>
+          <w:sz w:val="22"/>
+          <w:szCs w:val="22"/>
+        </w:rPr>
+        <w:t>This finding will be analysed below</w:t>
+      </w:r>
+      <w:r>
+        <w:rPr>
+          <w:sz w:val="22"/>
+          <w:szCs w:val="22"/>
+        </w:rPr>
+        <w:t xml:space="preserve"> </w:t>
+      </w:r>
+      <w:r>
+        <w:rPr>
+          <w:sz w:val="22"/>
+          <w:szCs w:val="22"/>
+        </w:rPr>
+        <w:t>in the report.</w:t>
       </w:r>
     </w:p>
     <w:p>
@@ -990,7 +1004,7 @@
       <w:proofErr w:type="spellStart"/>
       <w:r>
         <w:lastRenderedPageBreak/>
-        <w:t>proccessStateMachine</w:t>
+        <w:t>processStateMachine</w:t>
       </w:r>
       <w:proofErr w:type="spellEnd"/>
     </w:p>
@@ -1060,7 +1074,7 @@
       </w:r>
       <w:proofErr w:type="spellStart"/>
       <w:r>
-        <w:t>proccessStateMachine</w:t>
+        <w:t>processStateMachine</w:t>
       </w:r>
       <w:proofErr w:type="spellEnd"/>
       <w:r>
@@ -1373,16 +1387,14 @@
         </w:rPr>
         <w:t xml:space="preserve">r </w:t>
       </w:r>
-      <w:proofErr w:type="gramStart"/>
       <w:r>
         <w:rPr>
           <w:sz w:val="22"/>
           <w:szCs w:val="22"/>
           <w:lang w:val="en-US"/>
         </w:rPr>
-        <w:t>don’t</w:t>
-      </w:r>
-      <w:proofErr w:type="gramEnd"/>
+        <w:t>doesn’t</w:t>
+      </w:r>
       <w:r>
         <w:rPr>
           <w:sz w:val="22"/>
@@ -1718,7 +1730,7 @@
           <w:sz w:val="22"/>
           <w:szCs w:val="22"/>
         </w:rPr>
-        <w:t>proccessStateMachine</w:t>
+        <w:t>processStateMachine</w:t>
       </w:r>
       <w:proofErr w:type="spellEnd"/>
       <w:r>

</xml_diff>